<commit_message>
feat(saas): implement Dual Operating Model (Internal Municipal SaaS Subscription vs Molmos Managed Agency Debt Recovery), commercial terms, and pricing controls
</commit_message>
<xml_diff>
--- a/docs/CollectionsOS_Role_Based_Processes.docx
+++ b/docs/CollectionsOS_Role_Based_Processes.docx
@@ -60,7 +60,7 @@
           <w:color w:val="999999"/>
           <w:sz w:val="20"/>
         </w:rPr>
-        <w:t>Version 1.0  •  30 August 2026  •  Confidential</w:t>
+        <w:t>Version 1.0  •  31 August 2026  •  Confidential</w:t>
       </w:r>
     </w:p>
     <w:p>
@@ -603,17 +603,12 @@
         <w:pStyle w:val="Heading1"/>
       </w:pPr>
       <w:r>
-        <w:t>1. Document Purpose &amp; Role Overview</w:t>
-      </w:r>
-    </w:p>
-    <w:p>
-      <w:r>
-        <w:t>This document provides a complete, step-by-step operational guide for every role within the CollectionsOS municipal debt collection platform. Each section details the exact processes, API endpoints, expected inputs, outputs, and audit consequences for every action a user in that role would perform.</w:t>
-      </w:r>
-    </w:p>
-    <w:p>
-      <w:r>
-        <w:t>The document is organised by role, with each role's section structured as a series of named processes. Each process includes the business context, step-by-step procedure, relevant API endpoints, data validation rules, and the audit events generated.</w:t>
+        <w:t>1. Executive Overview &amp; Dual SaaS Business Models</w:t>
+      </w:r>
+    </w:p>
+    <w:p>
+      <w:r>
+        <w:t>CollectionsOS is engineered with dual commercial delivery capabilities, enabling both direct outsourced debt recovery operations by Molmos and self-service SaaS subscription licensing by municipal revenue departments.</w:t>
       </w:r>
     </w:p>
     <w:tbl>
@@ -629,26 +624,26 @@
         <w:tc>
           <w:tcPr>
             <w:tcW w:type="dxa" w:w="9406"/>
-            <w:shd w:fill="D6E4F0"/>
+            <w:shd w:fill="F3E5F5"/>
             <w:tcBorders>
-              <w:left w:val="single" w:sz="12" w:space="0" w:color="1F4E79"/>
+              <w:left w:val="single" w:sz="12" w:space="0" w:color="4A148C"/>
             </w:tcBorders>
           </w:tcPr>
           <w:p>
             <w:r>
               <w:rPr>
                 <w:b/>
-                <w:color w:val="1F4E79"/>
+                <w:color w:val="4A148C"/>
                 <w:sz w:val="20"/>
               </w:rPr>
-              <w:t xml:space="preserve">  ℹ️ NOTE:  </w:t>
+              <w:t xml:space="preserve">  ✅ RECOMMENDATION:  </w:t>
             </w:r>
             <w:r>
               <w:rPr>
                 <w:color w:val="333333"/>
                 <w:sz w:val="20"/>
               </w:rPr>
-              <w:t>This document covers the MVP (Phase 1) capabilities. Roles marked as 'Planned' have their permissions designed but enforcement through JWT/RBAC middleware is scheduled for Phase 2.</w:t>
+              <w:t>Molmos Strategic Dual Model: Municipalities can either (1) Subscribe to CollectionsOS as an internal SaaS operating system for their in-house revenue staff, or (2) Retain Molmos as a specialized outsourced debt recovery agency on a performance-based commission model.</w:t>
             </w:r>
           </w:p>
         </w:tc>
@@ -656,24 +651,11 @@
     </w:tbl>
     <w:p/>
     <w:p>
-      <w:r>
-        <w:br w:type="page"/>
-      </w:r>
-    </w:p>
-    <w:p>
-      <w:pPr>
-        <w:pStyle w:val="Heading1"/>
-      </w:pPr>
-      <w:r>
-        <w:t>2. Role Definitions &amp; Permission Matrix</w:t>
-      </w:r>
-    </w:p>
-    <w:p>
       <w:pPr>
         <w:pStyle w:val="Heading2"/>
       </w:pPr>
       <w:r>
-        <w:t>2.1 Role Definitions</w:t>
+        <w:t>1.1 Operating Model Comparison</w:t>
       </w:r>
     </w:p>
     <w:tbl>
@@ -703,7 +685,7 @@
                 <w:color w:val="FFFFFF"/>
                 <w:sz w:val="18"/>
               </w:rPr>
-              <w:t>Role</w:t>
+              <w:t>Dimension</w:t>
             </w:r>
           </w:p>
         </w:tc>
@@ -720,7 +702,7 @@
                 <w:color w:val="FFFFFF"/>
                 <w:sz w:val="18"/>
               </w:rPr>
-              <w:t>Scope</w:t>
+              <w:t>🛡️ Molmos Managed Service</w:t>
             </w:r>
           </w:p>
         </w:tc>
@@ -737,7 +719,7 @@
                 <w:color w:val="FFFFFF"/>
                 <w:sz w:val="18"/>
               </w:rPr>
-              <w:t>Primary Responsibility</w:t>
+              <w:t>💻 Internal Municipal SaaS</w:t>
             </w:r>
           </w:p>
         </w:tc>
@@ -754,7 +736,7 @@
                 <w:color w:val="FFFFFF"/>
                 <w:sz w:val="18"/>
               </w:rPr>
-              <w:t>Tenant Binding</w:t>
+              <w:t>🔄 Hybrid Model</w:t>
             </w:r>
           </w:p>
         </w:tc>
@@ -769,7 +751,7 @@
               <w:rPr>
                 <w:sz w:val="18"/>
               </w:rPr>
-              <w:t>SUPERADMIN</w:t>
+              <w:t>Target Customer</w:t>
             </w:r>
           </w:p>
         </w:tc>
@@ -782,7 +764,7 @@
               <w:rPr>
                 <w:sz w:val="18"/>
               </w:rPr>
-              <w:t>Platform-wide</w:t>
+              <w:t>Municipalities seeking external recovery capacity</w:t>
             </w:r>
           </w:p>
         </w:tc>
@@ -795,7 +777,7 @@
               <w:rPr>
                 <w:sz w:val="18"/>
               </w:rPr>
-              <w:t>Platform governance, tenant provisioning, user management, cross-tenant oversight</w:t>
+              <w:t>Municipalities with internal collections teams</w:t>
             </w:r>
           </w:p>
         </w:tc>
@@ -808,7 +790,7 @@
               <w:rPr>
                 <w:sz w:val="18"/>
               </w:rPr>
-              <w:t>None (global)</w:t>
+              <w:t>Municipalities outsourcing aged debt (&gt;120d)</w:t>
             </w:r>
           </w:p>
         </w:tc>
@@ -824,7 +806,7 @@
               <w:rPr>
                 <w:sz w:val="18"/>
               </w:rPr>
-              <w:t>ADMIN</w:t>
+              <w:t>Workforce Execution</w:t>
             </w:r>
           </w:p>
         </w:tc>
@@ -838,7 +820,7 @@
               <w:rPr>
                 <w:sz w:val="18"/>
               </w:rPr>
-              <w:t>Single tenant</w:t>
+              <w:t>Molmos Professional Collector Teams</w:t>
             </w:r>
           </w:p>
         </w:tc>
@@ -852,7 +834,7 @@
               <w:rPr>
                 <w:sz w:val="18"/>
               </w:rPr>
-              <w:t>Municipality operations: imports, case management, collector assignment, financial oversight</w:t>
+              <w:t>Internal Municipal Civil Servants</w:t>
             </w:r>
           </w:p>
         </w:tc>
@@ -866,7 +848,7 @@
               <w:rPr>
                 <w:sz w:val="18"/>
               </w:rPr>
-              <w:t>Bound to one tenant</w:t>
+              <w:t>Internal (Early Stage) + Molmos (Hardcore Debt)</w:t>
             </w:r>
           </w:p>
         </w:tc>
@@ -881,7 +863,7 @@
               <w:rPr>
                 <w:sz w:val="18"/>
               </w:rPr>
-              <w:t>COLLECTOR</w:t>
+              <w:t>Commercial Terms</w:t>
             </w:r>
           </w:p>
         </w:tc>
@@ -894,7 +876,7 @@
               <w:rPr>
                 <w:sz w:val="18"/>
               </w:rPr>
-              <w:t>Assigned cases</w:t>
+              <w:t>Success Commission (e.g. 10.00% of recovered debt)</w:t>
             </w:r>
           </w:p>
         </w:tc>
@@ -907,7 +889,7 @@
               <w:rPr>
                 <w:sz w:val="18"/>
               </w:rPr>
-              <w:t>Work collection cases: contact debtors, create promises, record payments</w:t>
+              <w:t>Monthly SaaS License Fee (e.g. R 45,000 / mo)</w:t>
             </w:r>
           </w:p>
         </w:tc>
@@ -920,7 +902,7 @@
               <w:rPr>
                 <w:sz w:val="18"/>
               </w:rPr>
-              <w:t>Bound to one tenant</w:t>
+              <w:t>Base Subscription + Performance Commission</w:t>
             </w:r>
           </w:p>
         </w:tc>
@@ -936,7 +918,7 @@
               <w:rPr>
                 <w:sz w:val="18"/>
               </w:rPr>
-              <w:t>AUDITOR</w:t>
+              <w:t>User Management</w:t>
             </w:r>
           </w:p>
         </w:tc>
@@ -950,7 +932,7 @@
               <w:rPr>
                 <w:sz w:val="18"/>
               </w:rPr>
-              <w:t>Single tenant (read-only)</w:t>
+              <w:t>Managed centrally by Molmos SuperAdmins</w:t>
             </w:r>
           </w:p>
         </w:tc>
@@ -964,7 +946,7 @@
               <w:rPr>
                 <w:sz w:val="18"/>
               </w:rPr>
-              <w:t>Compliance review: audit trail inspection, financial verification, process monitoring</w:t>
+              <w:t>Provisioned by SuperAdmin &amp; Municipal Admins</w:t>
             </w:r>
           </w:p>
         </w:tc>
@@ -978,7 +960,7 @@
               <w:rPr>
                 <w:sz w:val="18"/>
               </w:rPr>
-              <w:t>Bound to one tenant</w:t>
+              <w:t>Multi-tenancy split across internal and agency collectors</w:t>
             </w:r>
           </w:p>
         </w:tc>
@@ -993,7 +975,7 @@
               <w:rPr>
                 <w:sz w:val="18"/>
               </w:rPr>
-              <w:t>FINANCE_OFFICER</w:t>
+              <w:t>Work Queue Execution</w:t>
             </w:r>
           </w:p>
         </w:tc>
@@ -1006,7 +988,7 @@
               <w:rPr>
                 <w:sz w:val="18"/>
               </w:rPr>
-              <w:t>Single tenant</w:t>
+              <w:t>Molmos Collectors execute debtor actions directly</w:t>
             </w:r>
           </w:p>
         </w:tc>
@@ -1019,7 +1001,7 @@
               <w:rPr>
                 <w:sz w:val="18"/>
               </w:rPr>
-              <w:t>Financial operations: payment reconciliation, ledger review, balance verification</w:t>
+              <w:t>Municipal Collectors execute debtor actions directly</w:t>
             </w:r>
           </w:p>
         </w:tc>
@@ -1032,7 +1014,7 @@
               <w:rPr>
                 <w:sz w:val="18"/>
               </w:rPr>
-              <w:t>Bound to one tenant</w:t>
+              <w:t>Assigned based on portfolio aging and delinquency tier</w:t>
             </w:r>
           </w:p>
         </w:tc>
@@ -1048,7 +1030,7 @@
               <w:rPr>
                 <w:sz w:val="18"/>
               </w:rPr>
-              <w:t>SYSTEM</w:t>
+              <w:t>Executive Oversight</w:t>
             </w:r>
           </w:p>
         </w:tc>
@@ -1062,7 +1044,7 @@
               <w:rPr>
                 <w:sz w:val="18"/>
               </w:rPr>
-              <w:t>Automated</w:t>
+              <w:t>Municipal CFO has real-time view-only audit dashboards</w:t>
             </w:r>
           </w:p>
         </w:tc>
@@ -1076,7 +1058,7 @@
               <w:rPr>
                 <w:sz w:val="18"/>
               </w:rPr>
-              <w:t>Background processing: promise evaluation, payment allocation, state transitions</w:t>
+              <w:t>Municipal CFO and Admins have full operational control</w:t>
             </w:r>
           </w:p>
         </w:tc>
@@ -1090,7 +1072,7 @@
               <w:rPr>
                 <w:sz w:val="18"/>
               </w:rPr>
-              <w:t>Cross-tenant</w:t>
+              <w:t>Unified consolidated oversight across both teams</w:t>
             </w:r>
           </w:p>
         </w:tc>
@@ -1098,11 +1080,24 @@
     </w:tbl>
     <w:p/>
     <w:p>
+      <w:r>
+        <w:br w:type="page"/>
+      </w:r>
+    </w:p>
+    <w:p>
+      <w:pPr>
+        <w:pStyle w:val="Heading1"/>
+      </w:pPr>
+      <w:r>
+        <w:t>2. Role Definitions &amp; Permission Matrix</w:t>
+      </w:r>
+    </w:p>
+    <w:p>
       <w:pPr>
         <w:pStyle w:val="Heading2"/>
       </w:pPr>
       <w:r>
-        <w:t>2.2 Permission Matrix</w:t>
+        <w:t>2.1 Role Definitions</w:t>
       </w:r>
     </w:p>
     <w:tbl>
@@ -1113,18 +1108,16 @@
         <w:tblLook w:firstColumn="1" w:firstRow="1" w:lastColumn="0" w:lastRow="0" w:noHBand="0" w:noVBand="1" w:val="04A0"/>
       </w:tblPr>
       <w:tblGrid>
-        <w:gridCol w:w="1568"/>
-        <w:gridCol w:w="1568"/>
-        <w:gridCol w:w="1568"/>
-        <w:gridCol w:w="1568"/>
-        <w:gridCol w:w="1568"/>
-        <w:gridCol w:w="1568"/>
+        <w:gridCol w:w="2351"/>
+        <w:gridCol w:w="2351"/>
+        <w:gridCol w:w="2351"/>
+        <w:gridCol w:w="2351"/>
       </w:tblGrid>
       <w:tr>
         <w:tc>
           <w:tcPr>
-            <w:tcW w:type="dxa" w:w="1568"/>
-            <w:shd w:fill="283593"/>
+            <w:tcW w:type="dxa" w:w="2351"/>
+            <w:shd w:fill="1F4E79"/>
           </w:tcPr>
           <w:p>
             <w:r/>
@@ -1134,14 +1127,14 @@
                 <w:color w:val="FFFFFF"/>
                 <w:sz w:val="18"/>
               </w:rPr>
-              <w:t>Operation</w:t>
-            </w:r>
-          </w:p>
-        </w:tc>
-        <w:tc>
-          <w:tcPr>
-            <w:tcW w:type="dxa" w:w="1568"/>
-            <w:shd w:fill="283593"/>
+              <w:t>Role</w:t>
+            </w:r>
+          </w:p>
+        </w:tc>
+        <w:tc>
+          <w:tcPr>
+            <w:tcW w:type="dxa" w:w="2351"/>
+            <w:shd w:fill="1F4E79"/>
           </w:tcPr>
           <w:p>
             <w:r/>
@@ -1151,14 +1144,14 @@
                 <w:color w:val="FFFFFF"/>
                 <w:sz w:val="18"/>
               </w:rPr>
-              <w:t>SUPERADMIN</w:t>
-            </w:r>
-          </w:p>
-        </w:tc>
-        <w:tc>
-          <w:tcPr>
-            <w:tcW w:type="dxa" w:w="1568"/>
-            <w:shd w:fill="283593"/>
+              <w:t>Scope</w:t>
+            </w:r>
+          </w:p>
+        </w:tc>
+        <w:tc>
+          <w:tcPr>
+            <w:tcW w:type="dxa" w:w="2351"/>
+            <w:shd w:fill="1F4E79"/>
           </w:tcPr>
           <w:p>
             <w:r/>
@@ -1168,14 +1161,14 @@
                 <w:color w:val="FFFFFF"/>
                 <w:sz w:val="18"/>
               </w:rPr>
-              <w:t>ADMIN</w:t>
-            </w:r>
-          </w:p>
-        </w:tc>
-        <w:tc>
-          <w:tcPr>
-            <w:tcW w:type="dxa" w:w="1568"/>
-            <w:shd w:fill="283593"/>
+              <w:t>Primary Responsibility</w:t>
+            </w:r>
+          </w:p>
+        </w:tc>
+        <w:tc>
+          <w:tcPr>
+            <w:tcW w:type="dxa" w:w="2351"/>
+            <w:shd w:fill="1F4E79"/>
           </w:tcPr>
           <w:p>
             <w:r/>
@@ -1185,13 +1178,317 @@
                 <w:color w:val="FFFFFF"/>
                 <w:sz w:val="18"/>
               </w:rPr>
+              <w:t>Tenant Binding</w:t>
+            </w:r>
+          </w:p>
+        </w:tc>
+      </w:tr>
+      <w:tr>
+        <w:tc>
+          <w:tcPr>
+            <w:tcW w:type="dxa" w:w="2351"/>
+          </w:tcPr>
+          <w:p>
+            <w:r>
+              <w:rPr>
+                <w:sz w:val="18"/>
+              </w:rPr>
+              <w:t>SUPERADMIN</w:t>
+            </w:r>
+          </w:p>
+        </w:tc>
+        <w:tc>
+          <w:tcPr>
+            <w:tcW w:type="dxa" w:w="2351"/>
+          </w:tcPr>
+          <w:p>
+            <w:r>
+              <w:rPr>
+                <w:sz w:val="18"/>
+              </w:rPr>
+              <w:t>Platform-wide</w:t>
+            </w:r>
+          </w:p>
+        </w:tc>
+        <w:tc>
+          <w:tcPr>
+            <w:tcW w:type="dxa" w:w="2351"/>
+          </w:tcPr>
+          <w:p>
+            <w:r>
+              <w:rPr>
+                <w:sz w:val="18"/>
+              </w:rPr>
+              <w:t>Platform governance, tenant provisioning, SaaS commercial terms, global user management</w:t>
+            </w:r>
+          </w:p>
+        </w:tc>
+        <w:tc>
+          <w:tcPr>
+            <w:tcW w:type="dxa" w:w="2351"/>
+          </w:tcPr>
+          <w:p>
+            <w:r>
+              <w:rPr>
+                <w:sz w:val="18"/>
+              </w:rPr>
+              <w:t>None (global)</w:t>
+            </w:r>
+          </w:p>
+        </w:tc>
+      </w:tr>
+      <w:tr>
+        <w:tc>
+          <w:tcPr>
+            <w:tcW w:type="dxa" w:w="2351"/>
+            <w:shd w:fill="F2F2F2"/>
+          </w:tcPr>
+          <w:p>
+            <w:r>
+              <w:rPr>
+                <w:sz w:val="18"/>
+              </w:rPr>
+              <w:t>ADMIN</w:t>
+            </w:r>
+          </w:p>
+        </w:tc>
+        <w:tc>
+          <w:tcPr>
+            <w:tcW w:type="dxa" w:w="2351"/>
+            <w:shd w:fill="F2F2F2"/>
+          </w:tcPr>
+          <w:p>
+            <w:r>
+              <w:rPr>
+                <w:sz w:val="18"/>
+              </w:rPr>
+              <w:t>Assigned Municipalities</w:t>
+            </w:r>
+          </w:p>
+        </w:tc>
+        <w:tc>
+          <w:tcPr>
+            <w:tcW w:type="dxa" w:w="2351"/>
+            <w:shd w:fill="F2F2F2"/>
+          </w:tcPr>
+          <w:p>
+            <w:r>
+              <w:rPr>
+                <w:sz w:val="18"/>
+              </w:rPr>
+              <w:t>Municipal oversight: view-only work queues, debt books, financial dashboard review</w:t>
+            </w:r>
+          </w:p>
+        </w:tc>
+        <w:tc>
+          <w:tcPr>
+            <w:tcW w:type="dxa" w:w="2351"/>
+            <w:shd w:fill="F2F2F2"/>
+          </w:tcPr>
+          <w:p>
+            <w:r>
+              <w:rPr>
+                <w:sz w:val="18"/>
+              </w:rPr>
+              <w:t>Bound to 1+ assigned municipalities</w:t>
+            </w:r>
+          </w:p>
+        </w:tc>
+      </w:tr>
+      <w:tr>
+        <w:tc>
+          <w:tcPr>
+            <w:tcW w:type="dxa" w:w="2351"/>
+          </w:tcPr>
+          <w:p>
+            <w:r>
+              <w:rPr>
+                <w:sz w:val="18"/>
+              </w:rPr>
               <w:t>COLLECTOR</w:t>
             </w:r>
           </w:p>
         </w:tc>
         <w:tc>
           <w:tcPr>
-            <w:tcW w:type="dxa" w:w="1568"/>
+            <w:tcW w:type="dxa" w:w="2351"/>
+          </w:tcPr>
+          <w:p>
+            <w:r>
+              <w:rPr>
+                <w:sz w:val="18"/>
+              </w:rPr>
+              <w:t>Assigned Municipalities</w:t>
+            </w:r>
+          </w:p>
+        </w:tc>
+        <w:tc>
+          <w:tcPr>
+            <w:tcW w:type="dxa" w:w="2351"/>
+          </w:tcPr>
+          <w:p>
+            <w:r>
+              <w:rPr>
+                <w:sz w:val="18"/>
+              </w:rPr>
+              <w:t>Work collection cases: contact debtors, create PTPs, activate payment plans, post payments</w:t>
+            </w:r>
+          </w:p>
+        </w:tc>
+        <w:tc>
+          <w:tcPr>
+            <w:tcW w:type="dxa" w:w="2351"/>
+          </w:tcPr>
+          <w:p>
+            <w:r>
+              <w:rPr>
+                <w:sz w:val="18"/>
+              </w:rPr>
+              <w:t>Bound to 1+ assigned municipalities</w:t>
+            </w:r>
+          </w:p>
+        </w:tc>
+      </w:tr>
+      <w:tr>
+        <w:tc>
+          <w:tcPr>
+            <w:tcW w:type="dxa" w:w="2351"/>
+            <w:shd w:fill="F2F2F2"/>
+          </w:tcPr>
+          <w:p>
+            <w:r>
+              <w:rPr>
+                <w:sz w:val="18"/>
+              </w:rPr>
+              <w:t>AUDITOR</w:t>
+            </w:r>
+          </w:p>
+        </w:tc>
+        <w:tc>
+          <w:tcPr>
+            <w:tcW w:type="dxa" w:w="2351"/>
+            <w:shd w:fill="F2F2F2"/>
+          </w:tcPr>
+          <w:p>
+            <w:r>
+              <w:rPr>
+                <w:sz w:val="18"/>
+              </w:rPr>
+              <w:t>Assigned Municipalities (read-only)</w:t>
+            </w:r>
+          </w:p>
+        </w:tc>
+        <w:tc>
+          <w:tcPr>
+            <w:tcW w:type="dxa" w:w="2351"/>
+            <w:shd w:fill="F2F2F2"/>
+          </w:tcPr>
+          <w:p>
+            <w:r>
+              <w:rPr>
+                <w:sz w:val="18"/>
+              </w:rPr>
+              <w:t>Compliance review: audit trail inspection, financial verification, process monitoring</w:t>
+            </w:r>
+          </w:p>
+        </w:tc>
+        <w:tc>
+          <w:tcPr>
+            <w:tcW w:type="dxa" w:w="2351"/>
+            <w:shd w:fill="F2F2F2"/>
+          </w:tcPr>
+          <w:p>
+            <w:r>
+              <w:rPr>
+                <w:sz w:val="18"/>
+              </w:rPr>
+              <w:t>Bound to 1+ assigned municipalities</w:t>
+            </w:r>
+          </w:p>
+        </w:tc>
+      </w:tr>
+      <w:tr>
+        <w:tc>
+          <w:tcPr>
+            <w:tcW w:type="dxa" w:w="2351"/>
+          </w:tcPr>
+          <w:p>
+            <w:r>
+              <w:rPr>
+                <w:sz w:val="18"/>
+              </w:rPr>
+              <w:t>SYSTEM</w:t>
+            </w:r>
+          </w:p>
+        </w:tc>
+        <w:tc>
+          <w:tcPr>
+            <w:tcW w:type="dxa" w:w="2351"/>
+          </w:tcPr>
+          <w:p>
+            <w:r>
+              <w:rPr>
+                <w:sz w:val="18"/>
+              </w:rPr>
+              <w:t>Automated</w:t>
+            </w:r>
+          </w:p>
+        </w:tc>
+        <w:tc>
+          <w:tcPr>
+            <w:tcW w:type="dxa" w:w="2351"/>
+          </w:tcPr>
+          <w:p>
+            <w:r>
+              <w:rPr>
+                <w:sz w:val="18"/>
+              </w:rPr>
+              <w:t>Background processing: promise evaluation, payment allocation, state transitions</w:t>
+            </w:r>
+          </w:p>
+        </w:tc>
+        <w:tc>
+          <w:tcPr>
+            <w:tcW w:type="dxa" w:w="2351"/>
+          </w:tcPr>
+          <w:p>
+            <w:r>
+              <w:rPr>
+                <w:sz w:val="18"/>
+              </w:rPr>
+              <w:t>Cross-tenant</w:t>
+            </w:r>
+          </w:p>
+        </w:tc>
+      </w:tr>
+    </w:tbl>
+    <w:p/>
+    <w:p>
+      <w:pPr>
+        <w:pStyle w:val="Heading2"/>
+      </w:pPr>
+      <w:r>
+        <w:t>2.2 Permission Matrix</w:t>
+      </w:r>
+    </w:p>
+    <w:tbl>
+      <w:tblPr>
+        <w:tblStyle w:val="TableGrid"/>
+        <w:tblW w:type="auto" w:w="0"/>
+        <w:jc w:val="center"/>
+        <w:tblLook w:firstColumn="1" w:firstRow="1" w:lastColumn="0" w:lastRow="0" w:noHBand="0" w:noVBand="1" w:val="04A0"/>
+      </w:tblPr>
+      <w:tblGrid>
+        <w:gridCol w:w="1881"/>
+        <w:gridCol w:w="1881"/>
+        <w:gridCol w:w="1881"/>
+        <w:gridCol w:w="1881"/>
+        <w:gridCol w:w="1881"/>
+      </w:tblGrid>
+      <w:tr>
+        <w:tc>
+          <w:tcPr>
+            <w:tcW w:type="dxa" w:w="1881"/>
             <w:shd w:fill="283593"/>
           </w:tcPr>
           <w:p>
@@ -1202,13 +1499,13 @@
                 <w:color w:val="FFFFFF"/>
                 <w:sz w:val="18"/>
               </w:rPr>
-              <w:t>AUDITOR</w:t>
-            </w:r>
-          </w:p>
-        </w:tc>
-        <w:tc>
-          <w:tcPr>
-            <w:tcW w:type="dxa" w:w="1568"/>
+              <w:t>Operation</w:t>
+            </w:r>
+          </w:p>
+        </w:tc>
+        <w:tc>
+          <w:tcPr>
+            <w:tcW w:type="dxa" w:w="1881"/>
             <w:shd w:fill="283593"/>
           </w:tcPr>
           <w:p>
@@ -1219,7 +1516,58 @@
                 <w:color w:val="FFFFFF"/>
                 <w:sz w:val="18"/>
               </w:rPr>
-              <w:t>FINANCE</w:t>
+              <w:t>SUPERADMIN</w:t>
+            </w:r>
+          </w:p>
+        </w:tc>
+        <w:tc>
+          <w:tcPr>
+            <w:tcW w:type="dxa" w:w="1881"/>
+            <w:shd w:fill="283593"/>
+          </w:tcPr>
+          <w:p>
+            <w:r/>
+            <w:r>
+              <w:rPr>
+                <w:b/>
+                <w:color w:val="FFFFFF"/>
+                <w:sz w:val="18"/>
+              </w:rPr>
+              <w:t>ADMIN (Oversight)</w:t>
+            </w:r>
+          </w:p>
+        </w:tc>
+        <w:tc>
+          <w:tcPr>
+            <w:tcW w:type="dxa" w:w="1881"/>
+            <w:shd w:fill="283593"/>
+          </w:tcPr>
+          <w:p>
+            <w:r/>
+            <w:r>
+              <w:rPr>
+                <w:b/>
+                <w:color w:val="FFFFFF"/>
+                <w:sz w:val="18"/>
+              </w:rPr>
+              <w:t>COLLECTOR (Workbench)</w:t>
+            </w:r>
+          </w:p>
+        </w:tc>
+        <w:tc>
+          <w:tcPr>
+            <w:tcW w:type="dxa" w:w="1881"/>
+            <w:shd w:fill="283593"/>
+          </w:tcPr>
+          <w:p>
+            <w:r/>
+            <w:r>
+              <w:rPr>
+                <w:b/>
+                <w:color w:val="FFFFFF"/>
+                <w:sz w:val="18"/>
+              </w:rPr>
+              <w:t>AUDITOR (Read-Only)</w:t>
             </w:r>
           </w:p>
         </w:tc>
@@ -1227,20 +1575,20 @@
       <w:tr>
         <w:tc>
           <w:tcPr>
-            <w:tcW w:type="dxa" w:w="1568"/>
-          </w:tcPr>
-          <w:p>
-            <w:r>
-              <w:rPr>
-                <w:sz w:val="18"/>
-              </w:rPr>
-              <w:t>Create/manage tenants</w:t>
-            </w:r>
-          </w:p>
-        </w:tc>
-        <w:tc>
-          <w:tcPr>
-            <w:tcW w:type="dxa" w:w="1568"/>
+            <w:tcW w:type="dxa" w:w="1881"/>
+          </w:tcPr>
+          <w:p>
+            <w:r>
+              <w:rPr>
+                <w:sz w:val="18"/>
+              </w:rPr>
+              <w:t>Onboard Municipality (Tenant)</w:t>
+            </w:r>
+          </w:p>
+        </w:tc>
+        <w:tc>
+          <w:tcPr>
+            <w:tcW w:type="dxa" w:w="1881"/>
           </w:tcPr>
           <w:p>
             <w:r>
@@ -1253,7 +1601,7 @@
         </w:tc>
         <w:tc>
           <w:tcPr>
-            <w:tcW w:type="dxa" w:w="1568"/>
+            <w:tcW w:type="dxa" w:w="1881"/>
           </w:tcPr>
           <w:p>
             <w:r>
@@ -1266,7 +1614,7 @@
         </w:tc>
         <w:tc>
           <w:tcPr>
-            <w:tcW w:type="dxa" w:w="1568"/>
+            <w:tcW w:type="dxa" w:w="1881"/>
           </w:tcPr>
           <w:p>
             <w:r>
@@ -1279,20 +1627,7 @@
         </w:tc>
         <w:tc>
           <w:tcPr>
-            <w:tcW w:type="dxa" w:w="1568"/>
-          </w:tcPr>
-          <w:p>
-            <w:r>
-              <w:rPr>
-                <w:sz w:val="18"/>
-              </w:rPr>
-              <w:t>❌</w:t>
-            </w:r>
-          </w:p>
-        </w:tc>
-        <w:tc>
-          <w:tcPr>
-            <w:tcW w:type="dxa" w:w="1568"/>
+            <w:tcW w:type="dxa" w:w="1881"/>
           </w:tcPr>
           <w:p>
             <w:r>
@@ -1307,7 +1642,7 @@
       <w:tr>
         <w:tc>
           <w:tcPr>
-            <w:tcW w:type="dxa" w:w="1568"/>
+            <w:tcW w:type="dxa" w:w="1881"/>
             <w:shd w:fill="F2F2F2"/>
           </w:tcPr>
           <w:p>
@@ -1315,13 +1650,13 @@
               <w:rPr>
                 <w:sz w:val="18"/>
               </w:rPr>
-              <w:t>Create/manage users</w:t>
-            </w:r>
-          </w:p>
-        </w:tc>
-        <w:tc>
-          <w:tcPr>
-            <w:tcW w:type="dxa" w:w="1568"/>
+              <w:t>Configure SaaS / Molmos Terms</w:t>
+            </w:r>
+          </w:p>
+        </w:tc>
+        <w:tc>
+          <w:tcPr>
+            <w:tcW w:type="dxa" w:w="1881"/>
             <w:shd w:fill="F2F2F2"/>
           </w:tcPr>
           <w:p>
@@ -1335,7 +1670,7 @@
         </w:tc>
         <w:tc>
           <w:tcPr>
-            <w:tcW w:type="dxa" w:w="1568"/>
+            <w:tcW w:type="dxa" w:w="1881"/>
             <w:shd w:fill="F2F2F2"/>
           </w:tcPr>
           <w:p>
@@ -1343,13 +1678,13 @@
               <w:rPr>
                 <w:sz w:val="18"/>
               </w:rPr>
-              <w:t>✅ (own tenant)</w:t>
-            </w:r>
-          </w:p>
-        </w:tc>
-        <w:tc>
-          <w:tcPr>
-            <w:tcW w:type="dxa" w:w="1568"/>
+              <w:t>❌</w:t>
+            </w:r>
+          </w:p>
+        </w:tc>
+        <w:tc>
+          <w:tcPr>
+            <w:tcW w:type="dxa" w:w="1881"/>
             <w:shd w:fill="F2F2F2"/>
           </w:tcPr>
           <w:p>
@@ -1363,21 +1698,7 @@
         </w:tc>
         <w:tc>
           <w:tcPr>
-            <w:tcW w:type="dxa" w:w="1568"/>
-            <w:shd w:fill="F2F2F2"/>
-          </w:tcPr>
-          <w:p>
-            <w:r>
-              <w:rPr>
-                <w:sz w:val="18"/>
-              </w:rPr>
-              <w:t>❌</w:t>
-            </w:r>
-          </w:p>
-        </w:tc>
-        <w:tc>
-          <w:tcPr>
-            <w:tcW w:type="dxa" w:w="1568"/>
+            <w:tcW w:type="dxa" w:w="1881"/>
             <w:shd w:fill="F2F2F2"/>
           </w:tcPr>
           <w:p>
@@ -1393,20 +1714,20 @@
       <w:tr>
         <w:tc>
           <w:tcPr>
-            <w:tcW w:type="dxa" w:w="1568"/>
-          </w:tcPr>
-          <w:p>
-            <w:r>
-              <w:rPr>
-                <w:sz w:val="18"/>
-              </w:rPr>
-              <w:t>Import debt book CSV</w:t>
-            </w:r>
-          </w:p>
-        </w:tc>
-        <w:tc>
-          <w:tcPr>
-            <w:tcW w:type="dxa" w:w="1568"/>
+            <w:tcW w:type="dxa" w:w="1881"/>
+          </w:tcPr>
+          <w:p>
+            <w:r>
+              <w:rPr>
+                <w:sz w:val="18"/>
+              </w:rPr>
+              <w:t>User Provisioning &amp; Role Assignment</w:t>
+            </w:r>
+          </w:p>
+        </w:tc>
+        <w:tc>
+          <w:tcPr>
+            <w:tcW w:type="dxa" w:w="1881"/>
           </w:tcPr>
           <w:p>
             <w:r>
@@ -1419,20 +1740,7 @@
         </w:tc>
         <w:tc>
           <w:tcPr>
-            <w:tcW w:type="dxa" w:w="1568"/>
-          </w:tcPr>
-          <w:p>
-            <w:r>
-              <w:rPr>
-                <w:sz w:val="18"/>
-              </w:rPr>
-              <w:t>✅</w:t>
-            </w:r>
-          </w:p>
-        </w:tc>
-        <w:tc>
-          <w:tcPr>
-            <w:tcW w:type="dxa" w:w="1568"/>
+            <w:tcW w:type="dxa" w:w="1881"/>
           </w:tcPr>
           <w:p>
             <w:r>
@@ -1445,7 +1753,7 @@
         </w:tc>
         <w:tc>
           <w:tcPr>
-            <w:tcW w:type="dxa" w:w="1568"/>
+            <w:tcW w:type="dxa" w:w="1881"/>
           </w:tcPr>
           <w:p>
             <w:r>
@@ -1458,7 +1766,7 @@
         </w:tc>
         <w:tc>
           <w:tcPr>
-            <w:tcW w:type="dxa" w:w="1568"/>
+            <w:tcW w:type="dxa" w:w="1881"/>
           </w:tcPr>
           <w:p>
             <w:r>
@@ -1473,7 +1781,7 @@
       <w:tr>
         <w:tc>
           <w:tcPr>
-            <w:tcW w:type="dxa" w:w="1568"/>
+            <w:tcW w:type="dxa" w:w="1881"/>
             <w:shd w:fill="F2F2F2"/>
           </w:tcPr>
           <w:p>
@@ -1481,13 +1789,13 @@
               <w:rPr>
                 <w:sz w:val="18"/>
               </w:rPr>
-              <w:t>Generate collection cases</w:t>
-            </w:r>
-          </w:p>
-        </w:tc>
-        <w:tc>
-          <w:tcPr>
-            <w:tcW w:type="dxa" w:w="1568"/>
+              <w:t>Import Engine (Debt Book CSV/XLSX)</w:t>
+            </w:r>
+          </w:p>
+        </w:tc>
+        <w:tc>
+          <w:tcPr>
+            <w:tcW w:type="dxa" w:w="1881"/>
             <w:shd w:fill="F2F2F2"/>
           </w:tcPr>
           <w:p>
@@ -1501,7 +1809,7 @@
         </w:tc>
         <w:tc>
           <w:tcPr>
-            <w:tcW w:type="dxa" w:w="1568"/>
+            <w:tcW w:type="dxa" w:w="1881"/>
             <w:shd w:fill="F2F2F2"/>
           </w:tcPr>
           <w:p>
@@ -1509,13 +1817,13 @@
               <w:rPr>
                 <w:sz w:val="18"/>
               </w:rPr>
-              <w:t>✅</w:t>
-            </w:r>
-          </w:p>
-        </w:tc>
-        <w:tc>
-          <w:tcPr>
-            <w:tcW w:type="dxa" w:w="1568"/>
+              <w:t>❌</w:t>
+            </w:r>
+          </w:p>
+        </w:tc>
+        <w:tc>
+          <w:tcPr>
+            <w:tcW w:type="dxa" w:w="1881"/>
             <w:shd w:fill="F2F2F2"/>
           </w:tcPr>
           <w:p>
@@ -1529,21 +1837,7 @@
         </w:tc>
         <w:tc>
           <w:tcPr>
-            <w:tcW w:type="dxa" w:w="1568"/>
-            <w:shd w:fill="F2F2F2"/>
-          </w:tcPr>
-          <w:p>
-            <w:r>
-              <w:rPr>
-                <w:sz w:val="18"/>
-              </w:rPr>
-              <w:t>❌</w:t>
-            </w:r>
-          </w:p>
-        </w:tc>
-        <w:tc>
-          <w:tcPr>
-            <w:tcW w:type="dxa" w:w="1568"/>
+            <w:tcW w:type="dxa" w:w="1881"/>
             <w:shd w:fill="F2F2F2"/>
           </w:tcPr>
           <w:p>
@@ -1559,20 +1853,20 @@
       <w:tr>
         <w:tc>
           <w:tcPr>
-            <w:tcW w:type="dxa" w:w="1568"/>
-          </w:tcPr>
-          <w:p>
-            <w:r>
-              <w:rPr>
-                <w:sz w:val="18"/>
-              </w:rPr>
-              <w:t>Assign collectors to cases</w:t>
-            </w:r>
-          </w:p>
-        </w:tc>
-        <w:tc>
-          <w:tcPr>
-            <w:tcW w:type="dxa" w:w="1568"/>
+            <w:tcW w:type="dxa" w:w="1881"/>
+          </w:tcPr>
+          <w:p>
+            <w:r>
+              <w:rPr>
+                <w:sz w:val="18"/>
+              </w:rPr>
+              <w:t>View Debt Books &amp; Accounts</w:t>
+            </w:r>
+          </w:p>
+        </w:tc>
+        <w:tc>
+          <w:tcPr>
+            <w:tcW w:type="dxa" w:w="1881"/>
           </w:tcPr>
           <w:p>
             <w:r>
@@ -1585,53 +1879,40 @@
         </w:tc>
         <w:tc>
           <w:tcPr>
-            <w:tcW w:type="dxa" w:w="1568"/>
-          </w:tcPr>
-          <w:p>
-            <w:r>
-              <w:rPr>
-                <w:sz w:val="18"/>
-              </w:rPr>
-              <w:t>✅</w:t>
-            </w:r>
-          </w:p>
-        </w:tc>
-        <w:tc>
-          <w:tcPr>
-            <w:tcW w:type="dxa" w:w="1568"/>
-          </w:tcPr>
-          <w:p>
-            <w:r>
-              <w:rPr>
-                <w:sz w:val="18"/>
-              </w:rPr>
-              <w:t>❌</w:t>
-            </w:r>
-          </w:p>
-        </w:tc>
-        <w:tc>
-          <w:tcPr>
-            <w:tcW w:type="dxa" w:w="1568"/>
-          </w:tcPr>
-          <w:p>
-            <w:r>
-              <w:rPr>
-                <w:sz w:val="18"/>
-              </w:rPr>
-              <w:t>❌</w:t>
-            </w:r>
-          </w:p>
-        </w:tc>
-        <w:tc>
-          <w:tcPr>
-            <w:tcW w:type="dxa" w:w="1568"/>
-          </w:tcPr>
-          <w:p>
-            <w:r>
-              <w:rPr>
-                <w:sz w:val="18"/>
-              </w:rPr>
-              <w:t>❌</w:t>
+            <w:tcW w:type="dxa" w:w="1881"/>
+          </w:tcPr>
+          <w:p>
+            <w:r>
+              <w:rPr>
+                <w:sz w:val="18"/>
+              </w:rPr>
+              <w:t>✅ (View-Only)</w:t>
+            </w:r>
+          </w:p>
+        </w:tc>
+        <w:tc>
+          <w:tcPr>
+            <w:tcW w:type="dxa" w:w="1881"/>
+          </w:tcPr>
+          <w:p>
+            <w:r>
+              <w:rPr>
+                <w:sz w:val="18"/>
+              </w:rPr>
+              <w:t>✅ (Assigned Munis)</w:t>
+            </w:r>
+          </w:p>
+        </w:tc>
+        <w:tc>
+          <w:tcPr>
+            <w:tcW w:type="dxa" w:w="1881"/>
+          </w:tcPr>
+          <w:p>
+            <w:r>
+              <w:rPr>
+                <w:sz w:val="18"/>
+              </w:rPr>
+              <w:t>✅ (Read-Only)</w:t>
             </w:r>
           </w:p>
         </w:tc>
@@ -1639,7 +1920,7 @@
       <w:tr>
         <w:tc>
           <w:tcPr>
-            <w:tcW w:type="dxa" w:w="1568"/>
+            <w:tcW w:type="dxa" w:w="1881"/>
             <w:shd w:fill="F2F2F2"/>
           </w:tcPr>
           <w:p>
@@ -1647,13 +1928,13 @@
               <w:rPr>
                 <w:sz w:val="18"/>
               </w:rPr>
-              <w:t>View work queue</w:t>
-            </w:r>
-          </w:p>
-        </w:tc>
-        <w:tc>
-          <w:tcPr>
-            <w:tcW w:type="dxa" w:w="1568"/>
+              <w:t>View Collector Work Queue</w:t>
+            </w:r>
+          </w:p>
+        </w:tc>
+        <w:tc>
+          <w:tcPr>
+            <w:tcW w:type="dxa" w:w="1881"/>
             <w:shd w:fill="F2F2F2"/>
           </w:tcPr>
           <w:p>
@@ -1667,7 +1948,7 @@
         </w:tc>
         <w:tc>
           <w:tcPr>
-            <w:tcW w:type="dxa" w:w="1568"/>
+            <w:tcW w:type="dxa" w:w="1881"/>
             <w:shd w:fill="F2F2F2"/>
           </w:tcPr>
           <w:p>
@@ -1675,13 +1956,13 @@
               <w:rPr>
                 <w:sz w:val="18"/>
               </w:rPr>
-              <w:t>✅</w:t>
-            </w:r>
-          </w:p>
-        </w:tc>
-        <w:tc>
-          <w:tcPr>
-            <w:tcW w:type="dxa" w:w="1568"/>
+              <w:t>✅ (View-Only)</w:t>
+            </w:r>
+          </w:p>
+        </w:tc>
+        <w:tc>
+          <w:tcPr>
+            <w:tcW w:type="dxa" w:w="1881"/>
             <w:shd w:fill="F2F2F2"/>
           </w:tcPr>
           <w:p>
@@ -1689,13 +1970,13 @@
               <w:rPr>
                 <w:sz w:val="18"/>
               </w:rPr>
-              <w:t>✅ (own cases)</w:t>
-            </w:r>
-          </w:p>
-        </w:tc>
-        <w:tc>
-          <w:tcPr>
-            <w:tcW w:type="dxa" w:w="1568"/>
+              <w:t>✅ (Actionable)</w:t>
+            </w:r>
+          </w:p>
+        </w:tc>
+        <w:tc>
+          <w:tcPr>
+            <w:tcW w:type="dxa" w:w="1881"/>
             <w:shd w:fill="F2F2F2"/>
           </w:tcPr>
           <w:p>
@@ -1703,21 +1984,7 @@
               <w:rPr>
                 <w:sz w:val="18"/>
               </w:rPr>
-              <w:t>✅ (read-only)</w:t>
-            </w:r>
-          </w:p>
-        </w:tc>
-        <w:tc>
-          <w:tcPr>
-            <w:tcW w:type="dxa" w:w="1568"/>
-            <w:shd w:fill="F2F2F2"/>
-          </w:tcPr>
-          <w:p>
-            <w:r>
-              <w:rPr>
-                <w:sz w:val="18"/>
-              </w:rPr>
-              <w:t>❌</w:t>
+              <w:t>✅ (Read-Only)</w:t>
             </w:r>
           </w:p>
         </w:tc>
@@ -1725,20 +1992,20 @@
       <w:tr>
         <w:tc>
           <w:tcPr>
-            <w:tcW w:type="dxa" w:w="1568"/>
-          </w:tcPr>
-          <w:p>
-            <w:r>
-              <w:rPr>
-                <w:sz w:val="18"/>
-              </w:rPr>
-              <w:t>Record contact attempts</w:t>
-            </w:r>
-          </w:p>
-        </w:tc>
-        <w:tc>
-          <w:tcPr>
-            <w:tcW w:type="dxa" w:w="1568"/>
+            <w:tcW w:type="dxa" w:w="1881"/>
+          </w:tcPr>
+          <w:p>
+            <w:r>
+              <w:rPr>
+                <w:sz w:val="18"/>
+              </w:rPr>
+              <w:t>Record Contact Attempts</w:t>
+            </w:r>
+          </w:p>
+        </w:tc>
+        <w:tc>
+          <w:tcPr>
+            <w:tcW w:type="dxa" w:w="1881"/>
           </w:tcPr>
           <w:p>
             <w:r>
@@ -1751,7 +2018,7 @@
         </w:tc>
         <w:tc>
           <w:tcPr>
-            <w:tcW w:type="dxa" w:w="1568"/>
+            <w:tcW w:type="dxa" w:w="1881"/>
           </w:tcPr>
           <w:p>
             <w:r>
@@ -1764,7 +2031,7 @@
         </w:tc>
         <w:tc>
           <w:tcPr>
-            <w:tcW w:type="dxa" w:w="1568"/>
+            <w:tcW w:type="dxa" w:w="1881"/>
           </w:tcPr>
           <w:p>
             <w:r>
@@ -1777,20 +2044,7 @@
         </w:tc>
         <w:tc>
           <w:tcPr>
-            <w:tcW w:type="dxa" w:w="1568"/>
-          </w:tcPr>
-          <w:p>
-            <w:r>
-              <w:rPr>
-                <w:sz w:val="18"/>
-              </w:rPr>
-              <w:t>❌</w:t>
-            </w:r>
-          </w:p>
-        </w:tc>
-        <w:tc>
-          <w:tcPr>
-            <w:tcW w:type="dxa" w:w="1568"/>
+            <w:tcW w:type="dxa" w:w="1881"/>
           </w:tcPr>
           <w:p>
             <w:r>
@@ -1805,7 +2059,7 @@
       <w:tr>
         <w:tc>
           <w:tcPr>
-            <w:tcW w:type="dxa" w:w="1568"/>
+            <w:tcW w:type="dxa" w:w="1881"/>
             <w:shd w:fill="F2F2F2"/>
           </w:tcPr>
           <w:p>
@@ -1813,13 +2067,13 @@
               <w:rPr>
                 <w:sz w:val="18"/>
               </w:rPr>
-              <w:t>Create promises-to-pay</w:t>
-            </w:r>
-          </w:p>
-        </w:tc>
-        <w:tc>
-          <w:tcPr>
-            <w:tcW w:type="dxa" w:w="1568"/>
+              <w:t>Create Promises-to-Pay (PTP)</w:t>
+            </w:r>
+          </w:p>
+        </w:tc>
+        <w:tc>
+          <w:tcPr>
+            <w:tcW w:type="dxa" w:w="1881"/>
             <w:shd w:fill="F2F2F2"/>
           </w:tcPr>
           <w:p>
@@ -1833,7 +2087,7 @@
         </w:tc>
         <w:tc>
           <w:tcPr>
-            <w:tcW w:type="dxa" w:w="1568"/>
+            <w:tcW w:type="dxa" w:w="1881"/>
             <w:shd w:fill="F2F2F2"/>
           </w:tcPr>
           <w:p>
@@ -1847,7 +2101,7 @@
         </w:tc>
         <w:tc>
           <w:tcPr>
-            <w:tcW w:type="dxa" w:w="1568"/>
+            <w:tcW w:type="dxa" w:w="1881"/>
             <w:shd w:fill="F2F2F2"/>
           </w:tcPr>
           <w:p>
@@ -1861,21 +2115,7 @@
         </w:tc>
         <w:tc>
           <w:tcPr>
-            <w:tcW w:type="dxa" w:w="1568"/>
-            <w:shd w:fill="F2F2F2"/>
-          </w:tcPr>
-          <w:p>
-            <w:r>
-              <w:rPr>
-                <w:sz w:val="18"/>
-              </w:rPr>
-              <w:t>❌</w:t>
-            </w:r>
-          </w:p>
-        </w:tc>
-        <w:tc>
-          <w:tcPr>
-            <w:tcW w:type="dxa" w:w="1568"/>
+            <w:tcW w:type="dxa" w:w="1881"/>
             <w:shd w:fill="F2F2F2"/>
           </w:tcPr>
           <w:p>
@@ -1891,20 +2131,20 @@
       <w:tr>
         <w:tc>
           <w:tcPr>
-            <w:tcW w:type="dxa" w:w="1568"/>
-          </w:tcPr>
-          <w:p>
-            <w:r>
-              <w:rPr>
-                <w:sz w:val="18"/>
-              </w:rPr>
-              <w:t>Create payment arrangements</w:t>
-            </w:r>
-          </w:p>
-        </w:tc>
-        <w:tc>
-          <w:tcPr>
-            <w:tcW w:type="dxa" w:w="1568"/>
+            <w:tcW w:type="dxa" w:w="1881"/>
+          </w:tcPr>
+          <w:p>
+            <w:r>
+              <w:rPr>
+                <w:sz w:val="18"/>
+              </w:rPr>
+              <w:t>Activate Payment Arrangements</w:t>
+            </w:r>
+          </w:p>
+        </w:tc>
+        <w:tc>
+          <w:tcPr>
+            <w:tcW w:type="dxa" w:w="1881"/>
           </w:tcPr>
           <w:p>
             <w:r>
@@ -1917,7 +2157,20 @@
         </w:tc>
         <w:tc>
           <w:tcPr>
-            <w:tcW w:type="dxa" w:w="1568"/>
+            <w:tcW w:type="dxa" w:w="1881"/>
+          </w:tcPr>
+          <w:p>
+            <w:r>
+              <w:rPr>
+                <w:sz w:val="18"/>
+              </w:rPr>
+              <w:t>❌</w:t>
+            </w:r>
+          </w:p>
+        </w:tc>
+        <w:tc>
+          <w:tcPr>
+            <w:tcW w:type="dxa" w:w="1881"/>
           </w:tcPr>
           <w:p>
             <w:r>
@@ -1930,33 +2183,7 @@
         </w:tc>
         <w:tc>
           <w:tcPr>
-            <w:tcW w:type="dxa" w:w="1568"/>
-          </w:tcPr>
-          <w:p>
-            <w:r>
-              <w:rPr>
-                <w:sz w:val="18"/>
-              </w:rPr>
-              <w:t>✅</w:t>
-            </w:r>
-          </w:p>
-        </w:tc>
-        <w:tc>
-          <w:tcPr>
-            <w:tcW w:type="dxa" w:w="1568"/>
-          </w:tcPr>
-          <w:p>
-            <w:r>
-              <w:rPr>
-                <w:sz w:val="18"/>
-              </w:rPr>
-              <w:t>❌</w:t>
-            </w:r>
-          </w:p>
-        </w:tc>
-        <w:tc>
-          <w:tcPr>
-            <w:tcW w:type="dxa" w:w="1568"/>
+            <w:tcW w:type="dxa" w:w="1881"/>
           </w:tcPr>
           <w:p>
             <w:r>
@@ -1971,7 +2198,7 @@
       <w:tr>
         <w:tc>
           <w:tcPr>
-            <w:tcW w:type="dxa" w:w="1568"/>
+            <w:tcW w:type="dxa" w:w="1881"/>
             <w:shd w:fill="F2F2F2"/>
           </w:tcPr>
           <w:p>
@@ -1979,13 +2206,13 @@
               <w:rPr>
                 <w:sz w:val="18"/>
               </w:rPr>
-              <w:t>Record payments</w:t>
-            </w:r>
-          </w:p>
-        </w:tc>
-        <w:tc>
-          <w:tcPr>
-            <w:tcW w:type="dxa" w:w="1568"/>
+              <w:t>Capture &amp; Reconcile Payments</w:t>
+            </w:r>
+          </w:p>
+        </w:tc>
+        <w:tc>
+          <w:tcPr>
+            <w:tcW w:type="dxa" w:w="1881"/>
             <w:shd w:fill="F2F2F2"/>
           </w:tcPr>
           <w:p>
@@ -1999,7 +2226,7 @@
         </w:tc>
         <w:tc>
           <w:tcPr>
-            <w:tcW w:type="dxa" w:w="1568"/>
+            <w:tcW w:type="dxa" w:w="1881"/>
             <w:shd w:fill="F2F2F2"/>
           </w:tcPr>
           <w:p>
@@ -2007,13 +2234,27 @@
               <w:rPr>
                 <w:sz w:val="18"/>
               </w:rPr>
+              <w:t>❌</w:t>
+            </w:r>
+          </w:p>
+        </w:tc>
+        <w:tc>
+          <w:tcPr>
+            <w:tcW w:type="dxa" w:w="1881"/>
+            <w:shd w:fill="F2F2F2"/>
+          </w:tcPr>
+          <w:p>
+            <w:r>
+              <w:rPr>
+                <w:sz w:val="18"/>
+              </w:rPr>
               <w:t>✅</w:t>
             </w:r>
           </w:p>
         </w:tc>
         <w:tc>
           <w:tcPr>
-            <w:tcW w:type="dxa" w:w="1568"/>
+            <w:tcW w:type="dxa" w:w="1881"/>
             <w:shd w:fill="F2F2F2"/>
           </w:tcPr>
           <w:p>
@@ -2021,35 +2262,7 @@
               <w:rPr>
                 <w:sz w:val="18"/>
               </w:rPr>
-              <w:t>✅</w:t>
-            </w:r>
-          </w:p>
-        </w:tc>
-        <w:tc>
-          <w:tcPr>
-            <w:tcW w:type="dxa" w:w="1568"/>
-            <w:shd w:fill="F2F2F2"/>
-          </w:tcPr>
-          <w:p>
-            <w:r>
-              <w:rPr>
-                <w:sz w:val="18"/>
-              </w:rPr>
               <w:t>❌</w:t>
-            </w:r>
-          </w:p>
-        </w:tc>
-        <w:tc>
-          <w:tcPr>
-            <w:tcW w:type="dxa" w:w="1568"/>
-            <w:shd w:fill="F2F2F2"/>
-          </w:tcPr>
-          <w:p>
-            <w:r>
-              <w:rPr>
-                <w:sz w:val="18"/>
-              </w:rPr>
-              <w:t>✅</w:t>
             </w:r>
           </w:p>
         </w:tc>
@@ -2057,20 +2270,20 @@
       <w:tr>
         <w:tc>
           <w:tcPr>
-            <w:tcW w:type="dxa" w:w="1568"/>
-          </w:tcPr>
-          <w:p>
-            <w:r>
-              <w:rPr>
-                <w:sz w:val="18"/>
-              </w:rPr>
-              <w:t>Reconcile payments</w:t>
-            </w:r>
-          </w:p>
-        </w:tc>
-        <w:tc>
-          <w:tcPr>
-            <w:tcW w:type="dxa" w:w="1568"/>
+            <w:tcW w:type="dxa" w:w="1881"/>
+          </w:tcPr>
+          <w:p>
+            <w:r>
+              <w:rPr>
+                <w:sz w:val="18"/>
+              </w:rPr>
+              <w:t>View Financial Ledger &amp; Audit Trail</w:t>
+            </w:r>
+          </w:p>
+        </w:tc>
+        <w:tc>
+          <w:tcPr>
+            <w:tcW w:type="dxa" w:w="1881"/>
           </w:tcPr>
           <w:p>
             <w:r>
@@ -2083,7 +2296,7 @@
         </w:tc>
         <w:tc>
           <w:tcPr>
-            <w:tcW w:type="dxa" w:w="1568"/>
+            <w:tcW w:type="dxa" w:w="1881"/>
           </w:tcPr>
           <w:p>
             <w:r>
@@ -2096,7 +2309,7 @@
         </w:tc>
         <w:tc>
           <w:tcPr>
-            <w:tcW w:type="dxa" w:w="1568"/>
+            <w:tcW w:type="dxa" w:w="1881"/>
           </w:tcPr>
           <w:p>
             <w:r>
@@ -2109,20 +2322,7 @@
         </w:tc>
         <w:tc>
           <w:tcPr>
-            <w:tcW w:type="dxa" w:w="1568"/>
-          </w:tcPr>
-          <w:p>
-            <w:r>
-              <w:rPr>
-                <w:sz w:val="18"/>
-              </w:rPr>
-              <w:t>❌</w:t>
-            </w:r>
-          </w:p>
-        </w:tc>
-        <w:tc>
-          <w:tcPr>
-            <w:tcW w:type="dxa" w:w="1568"/>
+            <w:tcW w:type="dxa" w:w="1881"/>
           </w:tcPr>
           <w:p>
             <w:r>
@@ -2137,7 +2337,7 @@
       <w:tr>
         <w:tc>
           <w:tcPr>
-            <w:tcW w:type="dxa" w:w="1568"/>
+            <w:tcW w:type="dxa" w:w="1881"/>
             <w:shd w:fill="F2F2F2"/>
           </w:tcPr>
           <w:p>
@@ -2145,13 +2345,13 @@
               <w:rPr>
                 <w:sz w:val="18"/>
               </w:rPr>
-              <w:t>Transition case status</w:t>
-            </w:r>
-          </w:p>
-        </w:tc>
-        <w:tc>
-          <w:tcPr>
-            <w:tcW w:type="dxa" w:w="1568"/>
+              <w:t>View Executive Analytics Dashboard</w:t>
+            </w:r>
+          </w:p>
+        </w:tc>
+        <w:tc>
+          <w:tcPr>
+            <w:tcW w:type="dxa" w:w="1881"/>
             <w:shd w:fill="F2F2F2"/>
           </w:tcPr>
           <w:p>
@@ -2165,7 +2365,7 @@
         </w:tc>
         <w:tc>
           <w:tcPr>
-            <w:tcW w:type="dxa" w:w="1568"/>
+            <w:tcW w:type="dxa" w:w="1881"/>
             <w:shd w:fill="F2F2F2"/>
           </w:tcPr>
           <w:p>
@@ -2179,7 +2379,7 @@
         </w:tc>
         <w:tc>
           <w:tcPr>
-            <w:tcW w:type="dxa" w:w="1568"/>
+            <w:tcW w:type="dxa" w:w="1881"/>
             <w:shd w:fill="F2F2F2"/>
           </w:tcPr>
           <w:p>
@@ -2187,13 +2387,13 @@
               <w:rPr>
                 <w:sz w:val="18"/>
               </w:rPr>
-              <w:t>✅ (limited)</w:t>
-            </w:r>
-          </w:p>
-        </w:tc>
-        <w:tc>
-          <w:tcPr>
-            <w:tcW w:type="dxa" w:w="1568"/>
+              <w:t>✅</w:t>
+            </w:r>
+          </w:p>
+        </w:tc>
+        <w:tc>
+          <w:tcPr>
+            <w:tcW w:type="dxa" w:w="1881"/>
             <w:shd w:fill="F2F2F2"/>
           </w:tcPr>
           <w:p>
@@ -2201,599 +2401,7 @@
               <w:rPr>
                 <w:sz w:val="18"/>
               </w:rPr>
-              <w:t>❌</w:t>
-            </w:r>
-          </w:p>
-        </w:tc>
-        <w:tc>
-          <w:tcPr>
-            <w:tcW w:type="dxa" w:w="1568"/>
-            <w:shd w:fill="F2F2F2"/>
-          </w:tcPr>
-          <w:p>
-            <w:r>
-              <w:rPr>
-                <w:sz w:val="18"/>
-              </w:rPr>
-              <w:t>❌</w:t>
-            </w:r>
-          </w:p>
-        </w:tc>
-      </w:tr>
-      <w:tr>
-        <w:tc>
-          <w:tcPr>
-            <w:tcW w:type="dxa" w:w="1568"/>
-          </w:tcPr>
-          <w:p>
-            <w:r>
-              <w:rPr>
-                <w:sz w:val="18"/>
-              </w:rPr>
-              <w:t>Post opening balances</w:t>
-            </w:r>
-          </w:p>
-        </w:tc>
-        <w:tc>
-          <w:tcPr>
-            <w:tcW w:type="dxa" w:w="1568"/>
-          </w:tcPr>
-          <w:p>
-            <w:r>
-              <w:rPr>
-                <w:sz w:val="18"/>
-              </w:rPr>
               <w:t>✅</w:t>
-            </w:r>
-          </w:p>
-        </w:tc>
-        <w:tc>
-          <w:tcPr>
-            <w:tcW w:type="dxa" w:w="1568"/>
-          </w:tcPr>
-          <w:p>
-            <w:r>
-              <w:rPr>
-                <w:sz w:val="18"/>
-              </w:rPr>
-              <w:t>✅</w:t>
-            </w:r>
-          </w:p>
-        </w:tc>
-        <w:tc>
-          <w:tcPr>
-            <w:tcW w:type="dxa" w:w="1568"/>
-          </w:tcPr>
-          <w:p>
-            <w:r>
-              <w:rPr>
-                <w:sz w:val="18"/>
-              </w:rPr>
-              <w:t>❌</w:t>
-            </w:r>
-          </w:p>
-        </w:tc>
-        <w:tc>
-          <w:tcPr>
-            <w:tcW w:type="dxa" w:w="1568"/>
-          </w:tcPr>
-          <w:p>
-            <w:r>
-              <w:rPr>
-                <w:sz w:val="18"/>
-              </w:rPr>
-              <w:t>❌</w:t>
-            </w:r>
-          </w:p>
-        </w:tc>
-        <w:tc>
-          <w:tcPr>
-            <w:tcW w:type="dxa" w:w="1568"/>
-          </w:tcPr>
-          <w:p>
-            <w:r>
-              <w:rPr>
-                <w:sz w:val="18"/>
-              </w:rPr>
-              <w:t>✅</w:t>
-            </w:r>
-          </w:p>
-        </w:tc>
-      </w:tr>
-      <w:tr>
-        <w:tc>
-          <w:tcPr>
-            <w:tcW w:type="dxa" w:w="1568"/>
-            <w:shd w:fill="F2F2F2"/>
-          </w:tcPr>
-          <w:p>
-            <w:r>
-              <w:rPr>
-                <w:sz w:val="18"/>
-              </w:rPr>
-              <w:t>Import batch transactions</w:t>
-            </w:r>
-          </w:p>
-        </w:tc>
-        <w:tc>
-          <w:tcPr>
-            <w:tcW w:type="dxa" w:w="1568"/>
-            <w:shd w:fill="F2F2F2"/>
-          </w:tcPr>
-          <w:p>
-            <w:r>
-              <w:rPr>
-                <w:sz w:val="18"/>
-              </w:rPr>
-              <w:t>✅</w:t>
-            </w:r>
-          </w:p>
-        </w:tc>
-        <w:tc>
-          <w:tcPr>
-            <w:tcW w:type="dxa" w:w="1568"/>
-            <w:shd w:fill="F2F2F2"/>
-          </w:tcPr>
-          <w:p>
-            <w:r>
-              <w:rPr>
-                <w:sz w:val="18"/>
-              </w:rPr>
-              <w:t>✅</w:t>
-            </w:r>
-          </w:p>
-        </w:tc>
-        <w:tc>
-          <w:tcPr>
-            <w:tcW w:type="dxa" w:w="1568"/>
-            <w:shd w:fill="F2F2F2"/>
-          </w:tcPr>
-          <w:p>
-            <w:r>
-              <w:rPr>
-                <w:sz w:val="18"/>
-              </w:rPr>
-              <w:t>❌</w:t>
-            </w:r>
-          </w:p>
-        </w:tc>
-        <w:tc>
-          <w:tcPr>
-            <w:tcW w:type="dxa" w:w="1568"/>
-            <w:shd w:fill="F2F2F2"/>
-          </w:tcPr>
-          <w:p>
-            <w:r>
-              <w:rPr>
-                <w:sz w:val="18"/>
-              </w:rPr>
-              <w:t>❌</w:t>
-            </w:r>
-          </w:p>
-        </w:tc>
-        <w:tc>
-          <w:tcPr>
-            <w:tcW w:type="dxa" w:w="1568"/>
-            <w:shd w:fill="F2F2F2"/>
-          </w:tcPr>
-          <w:p>
-            <w:r>
-              <w:rPr>
-                <w:sz w:val="18"/>
-              </w:rPr>
-              <w:t>✅</w:t>
-            </w:r>
-          </w:p>
-        </w:tc>
-      </w:tr>
-      <w:tr>
-        <w:tc>
-          <w:tcPr>
-            <w:tcW w:type="dxa" w:w="1568"/>
-          </w:tcPr>
-          <w:p>
-            <w:r>
-              <w:rPr>
-                <w:sz w:val="18"/>
-              </w:rPr>
-              <w:t>Run balance reconciliation</w:t>
-            </w:r>
-          </w:p>
-        </w:tc>
-        <w:tc>
-          <w:tcPr>
-            <w:tcW w:type="dxa" w:w="1568"/>
-          </w:tcPr>
-          <w:p>
-            <w:r>
-              <w:rPr>
-                <w:sz w:val="18"/>
-              </w:rPr>
-              <w:t>✅</w:t>
-            </w:r>
-          </w:p>
-        </w:tc>
-        <w:tc>
-          <w:tcPr>
-            <w:tcW w:type="dxa" w:w="1568"/>
-          </w:tcPr>
-          <w:p>
-            <w:r>
-              <w:rPr>
-                <w:sz w:val="18"/>
-              </w:rPr>
-              <w:t>✅</w:t>
-            </w:r>
-          </w:p>
-        </w:tc>
-        <w:tc>
-          <w:tcPr>
-            <w:tcW w:type="dxa" w:w="1568"/>
-          </w:tcPr>
-          <w:p>
-            <w:r>
-              <w:rPr>
-                <w:sz w:val="18"/>
-              </w:rPr>
-              <w:t>❌</w:t>
-            </w:r>
-          </w:p>
-        </w:tc>
-        <w:tc>
-          <w:tcPr>
-            <w:tcW w:type="dxa" w:w="1568"/>
-          </w:tcPr>
-          <w:p>
-            <w:r>
-              <w:rPr>
-                <w:sz w:val="18"/>
-              </w:rPr>
-              <w:t>✅</w:t>
-            </w:r>
-          </w:p>
-        </w:tc>
-        <w:tc>
-          <w:tcPr>
-            <w:tcW w:type="dxa" w:w="1568"/>
-          </w:tcPr>
-          <w:p>
-            <w:r>
-              <w:rPr>
-                <w:sz w:val="18"/>
-              </w:rPr>
-              <w:t>✅</w:t>
-            </w:r>
-          </w:p>
-        </w:tc>
-      </w:tr>
-      <w:tr>
-        <w:tc>
-          <w:tcPr>
-            <w:tcW w:type="dxa" w:w="1568"/>
-            <w:shd w:fill="F2F2F2"/>
-          </w:tcPr>
-          <w:p>
-            <w:r>
-              <w:rPr>
-                <w:sz w:val="18"/>
-              </w:rPr>
-              <w:t>View audit events</w:t>
-            </w:r>
-          </w:p>
-        </w:tc>
-        <w:tc>
-          <w:tcPr>
-            <w:tcW w:type="dxa" w:w="1568"/>
-            <w:shd w:fill="F2F2F2"/>
-          </w:tcPr>
-          <w:p>
-            <w:r>
-              <w:rPr>
-                <w:sz w:val="18"/>
-              </w:rPr>
-              <w:t>✅</w:t>
-            </w:r>
-          </w:p>
-        </w:tc>
-        <w:tc>
-          <w:tcPr>
-            <w:tcW w:type="dxa" w:w="1568"/>
-            <w:shd w:fill="F2F2F2"/>
-          </w:tcPr>
-          <w:p>
-            <w:r>
-              <w:rPr>
-                <w:sz w:val="18"/>
-              </w:rPr>
-              <w:t>✅</w:t>
-            </w:r>
-          </w:p>
-        </w:tc>
-        <w:tc>
-          <w:tcPr>
-            <w:tcW w:type="dxa" w:w="1568"/>
-            <w:shd w:fill="F2F2F2"/>
-          </w:tcPr>
-          <w:p>
-            <w:r>
-              <w:rPr>
-                <w:sz w:val="18"/>
-              </w:rPr>
-              <w:t>❌</w:t>
-            </w:r>
-          </w:p>
-        </w:tc>
-        <w:tc>
-          <w:tcPr>
-            <w:tcW w:type="dxa" w:w="1568"/>
-            <w:shd w:fill="F2F2F2"/>
-          </w:tcPr>
-          <w:p>
-            <w:r>
-              <w:rPr>
-                <w:sz w:val="18"/>
-              </w:rPr>
-              <w:t>✅</w:t>
-            </w:r>
-          </w:p>
-        </w:tc>
-        <w:tc>
-          <w:tcPr>
-            <w:tcW w:type="dxa" w:w="1568"/>
-            <w:shd w:fill="F2F2F2"/>
-          </w:tcPr>
-          <w:p>
-            <w:r>
-              <w:rPr>
-                <w:sz w:val="18"/>
-              </w:rPr>
-              <w:t>❌</w:t>
-            </w:r>
-          </w:p>
-        </w:tc>
-      </w:tr>
-      <w:tr>
-        <w:tc>
-          <w:tcPr>
-            <w:tcW w:type="dxa" w:w="1568"/>
-          </w:tcPr>
-          <w:p>
-            <w:r>
-              <w:rPr>
-                <w:sz w:val="18"/>
-              </w:rPr>
-              <w:t>View financial ledger</w:t>
-            </w:r>
-          </w:p>
-        </w:tc>
-        <w:tc>
-          <w:tcPr>
-            <w:tcW w:type="dxa" w:w="1568"/>
-          </w:tcPr>
-          <w:p>
-            <w:r>
-              <w:rPr>
-                <w:sz w:val="18"/>
-              </w:rPr>
-              <w:t>✅</w:t>
-            </w:r>
-          </w:p>
-        </w:tc>
-        <w:tc>
-          <w:tcPr>
-            <w:tcW w:type="dxa" w:w="1568"/>
-          </w:tcPr>
-          <w:p>
-            <w:r>
-              <w:rPr>
-                <w:sz w:val="18"/>
-              </w:rPr>
-              <w:t>✅</w:t>
-            </w:r>
-          </w:p>
-        </w:tc>
-        <w:tc>
-          <w:tcPr>
-            <w:tcW w:type="dxa" w:w="1568"/>
-          </w:tcPr>
-          <w:p>
-            <w:r>
-              <w:rPr>
-                <w:sz w:val="18"/>
-              </w:rPr>
-              <w:t>❌</w:t>
-            </w:r>
-          </w:p>
-        </w:tc>
-        <w:tc>
-          <w:tcPr>
-            <w:tcW w:type="dxa" w:w="1568"/>
-          </w:tcPr>
-          <w:p>
-            <w:r>
-              <w:rPr>
-                <w:sz w:val="18"/>
-              </w:rPr>
-              <w:t>✅</w:t>
-            </w:r>
-          </w:p>
-        </w:tc>
-        <w:tc>
-          <w:tcPr>
-            <w:tcW w:type="dxa" w:w="1568"/>
-          </w:tcPr>
-          <w:p>
-            <w:r>
-              <w:rPr>
-                <w:sz w:val="18"/>
-              </w:rPr>
-              <w:t>✅</w:t>
-            </w:r>
-          </w:p>
-        </w:tc>
-      </w:tr>
-      <w:tr>
-        <w:tc>
-          <w:tcPr>
-            <w:tcW w:type="dxa" w:w="1568"/>
-            <w:shd w:fill="F2F2F2"/>
-          </w:tcPr>
-          <w:p>
-            <w:r>
-              <w:rPr>
-                <w:sz w:val="18"/>
-              </w:rPr>
-              <w:t>View dashboard</w:t>
-            </w:r>
-          </w:p>
-        </w:tc>
-        <w:tc>
-          <w:tcPr>
-            <w:tcW w:type="dxa" w:w="1568"/>
-            <w:shd w:fill="F2F2F2"/>
-          </w:tcPr>
-          <w:p>
-            <w:r>
-              <w:rPr>
-                <w:sz w:val="18"/>
-              </w:rPr>
-              <w:t>✅</w:t>
-            </w:r>
-          </w:p>
-        </w:tc>
-        <w:tc>
-          <w:tcPr>
-            <w:tcW w:type="dxa" w:w="1568"/>
-            <w:shd w:fill="F2F2F2"/>
-          </w:tcPr>
-          <w:p>
-            <w:r>
-              <w:rPr>
-                <w:sz w:val="18"/>
-              </w:rPr>
-              <w:t>✅</w:t>
-            </w:r>
-          </w:p>
-        </w:tc>
-        <w:tc>
-          <w:tcPr>
-            <w:tcW w:type="dxa" w:w="1568"/>
-            <w:shd w:fill="F2F2F2"/>
-          </w:tcPr>
-          <w:p>
-            <w:r>
-              <w:rPr>
-                <w:sz w:val="18"/>
-              </w:rPr>
-              <w:t>✅</w:t>
-            </w:r>
-          </w:p>
-        </w:tc>
-        <w:tc>
-          <w:tcPr>
-            <w:tcW w:type="dxa" w:w="1568"/>
-            <w:shd w:fill="F2F2F2"/>
-          </w:tcPr>
-          <w:p>
-            <w:r>
-              <w:rPr>
-                <w:sz w:val="18"/>
-              </w:rPr>
-              <w:t>✅</w:t>
-            </w:r>
-          </w:p>
-        </w:tc>
-        <w:tc>
-          <w:tcPr>
-            <w:tcW w:type="dxa" w:w="1568"/>
-            <w:shd w:fill="F2F2F2"/>
-          </w:tcPr>
-          <w:p>
-            <w:r>
-              <w:rPr>
-                <w:sz w:val="18"/>
-              </w:rPr>
-              <w:t>✅</w:t>
-            </w:r>
-          </w:p>
-        </w:tc>
-      </w:tr>
-      <w:tr>
-        <w:tc>
-          <w:tcPr>
-            <w:tcW w:type="dxa" w:w="1568"/>
-          </w:tcPr>
-          <w:p>
-            <w:r>
-              <w:rPr>
-                <w:sz w:val="18"/>
-              </w:rPr>
-              <w:t>Close/escalate cases</w:t>
-            </w:r>
-          </w:p>
-        </w:tc>
-        <w:tc>
-          <w:tcPr>
-            <w:tcW w:type="dxa" w:w="1568"/>
-          </w:tcPr>
-          <w:p>
-            <w:r>
-              <w:rPr>
-                <w:sz w:val="18"/>
-              </w:rPr>
-              <w:t>✅</w:t>
-            </w:r>
-          </w:p>
-        </w:tc>
-        <w:tc>
-          <w:tcPr>
-            <w:tcW w:type="dxa" w:w="1568"/>
-          </w:tcPr>
-          <w:p>
-            <w:r>
-              <w:rPr>
-                <w:sz w:val="18"/>
-              </w:rPr>
-              <w:t>✅</w:t>
-            </w:r>
-          </w:p>
-        </w:tc>
-        <w:tc>
-          <w:tcPr>
-            <w:tcW w:type="dxa" w:w="1568"/>
-          </w:tcPr>
-          <w:p>
-            <w:r>
-              <w:rPr>
-                <w:sz w:val="18"/>
-              </w:rPr>
-              <w:t>❌</w:t>
-            </w:r>
-          </w:p>
-        </w:tc>
-        <w:tc>
-          <w:tcPr>
-            <w:tcW w:type="dxa" w:w="1568"/>
-          </w:tcPr>
-          <w:p>
-            <w:r>
-              <w:rPr>
-                <w:sz w:val="18"/>
-              </w:rPr>
-              <w:t>❌</w:t>
-            </w:r>
-          </w:p>
-        </w:tc>
-        <w:tc>
-          <w:tcPr>
-            <w:tcW w:type="dxa" w:w="1568"/>
-          </w:tcPr>
-          <w:p>
-            <w:r>
-              <w:rPr>
-                <w:sz w:val="18"/>
-              </w:rPr>
-              <w:t>❌</w:t>
             </w:r>
           </w:p>
         </w:tc>

</xml_diff>